<commit_message>
Finialize HMSC and HHID
</commit_message>
<xml_diff>
--- a/MICROCONTROLERS/RX65N/USB/USB_HSMC_FINAL/Setup/1_USB_HMSC_device_config_fd.docx
+++ b/MICROCONTROLERS/RX65N/USB/USB_HSMC_FINAL/Setup/1_USB_HMSC_device_config_fd.docx
@@ -246,6 +246,9 @@
     </w:p>
     <w:p>
       <w:r>
+        <w:rPr>
+          <w:noProof/>
+        </w:rPr>
         <w:drawing>
           <wp:inline distT="0" distB="0" distL="0" distR="0" wp14:anchorId="55586852" wp14:editId="20433230">
             <wp:extent cx="5943600" cy="3143250"/>
@@ -292,10 +295,7 @@
         </w:numPr>
       </w:pPr>
       <w:r>
-        <w:t>Get</w:t>
-      </w:r>
-      <w:r>
-        <w:t xml:space="preserve"> </w:t>
+        <w:t xml:space="preserve">Get </w:t>
       </w:r>
       <w:proofErr w:type="spellStart"/>
       <w:r>
@@ -303,17 +303,14 @@
       </w:r>
       <w:proofErr w:type="spellEnd"/>
       <w:r>
-        <w:t xml:space="preserve"> descriptor (</w:t>
-      </w:r>
-      <w:r>
-        <w:t>9</w:t>
-      </w:r>
-      <w:r>
-        <w:t xml:space="preserve"> bytes)</w:t>
-      </w:r>
-    </w:p>
-    <w:p>
-      <w:r>
+        <w:t xml:space="preserve"> descriptor (9 bytes)</w:t>
+      </w:r>
+    </w:p>
+    <w:p>
+      <w:r>
+        <w:rPr>
+          <w:noProof/>
+        </w:rPr>
         <w:drawing>
           <wp:inline distT="0" distB="0" distL="0" distR="0" wp14:anchorId="6F5A32D3" wp14:editId="4D80B57E">
             <wp:extent cx="5943600" cy="1036320"/>
@@ -434,23 +431,14 @@
         <w:rPr>
           <w:color w:val="FF0000"/>
         </w:rPr>
-        <w:t xml:space="preserve"> descriptor (</w:t>
-      </w:r>
-      <w:r>
-        <w:rPr>
-          <w:color w:val="FF0000"/>
-        </w:rPr>
-        <w:t>next 23 bytes</w:t>
-      </w:r>
-      <w:r>
-        <w:rPr>
-          <w:color w:val="FF0000"/>
-        </w:rPr>
-        <w:t>)</w:t>
-      </w:r>
-    </w:p>
-    <w:p>
-      <w:r>
+        <w:t xml:space="preserve"> descriptor (next 23 bytes)</w:t>
+      </w:r>
+    </w:p>
+    <w:p>
+      <w:r>
+        <w:rPr>
+          <w:noProof/>
+        </w:rPr>
         <w:lastRenderedPageBreak/>
         <w:drawing>
           <wp:inline distT="0" distB="0" distL="0" distR="0" wp14:anchorId="7BD46C9E" wp14:editId="4CB9B738">
@@ -508,9 +496,9 @@
         </w:rPr>
         <w:drawing>
           <wp:inline distT="0" distB="0" distL="0" distR="0">
-            <wp:extent cx="6855195" cy="2865120"/>
-            <wp:effectExtent l="0" t="0" r="3175" b="0"/>
-            <wp:docPr id="11" name="Picture 11"/>
+            <wp:extent cx="5938520" cy="2458720"/>
+            <wp:effectExtent l="0" t="0" r="5080" b="0"/>
+            <wp:docPr id="7" name="Picture 7"/>
             <wp:cNvGraphicFramePr>
               <a:graphicFrameLocks xmlns:a="http://schemas.openxmlformats.org/drawingml/2006/main" noChangeAspect="1"/>
             </wp:cNvGraphicFramePr>
@@ -539,7 +527,7 @@
                   <pic:spPr bwMode="auto">
                     <a:xfrm>
                       <a:off x="0" y="0"/>
-                      <a:ext cx="6870390" cy="2871471"/>
+                      <a:ext cx="5938520" cy="2458720"/>
                     </a:xfrm>
                     <a:prstGeom prst="rect">
                       <a:avLst/>
@@ -555,6 +543,8 @@
           </wp:inline>
         </w:drawing>
       </w:r>
+      <w:bookmarkStart w:id="0" w:name="_GoBack"/>
+      <w:bookmarkEnd w:id="0"/>
     </w:p>
     <w:p>
       <w:pPr>
@@ -610,7 +600,9 @@
     </w:p>
     <w:p>
       <w:r>
-        <w:lastRenderedPageBreak/>
+        <w:rPr>
+          <w:noProof/>
+        </w:rPr>
         <w:drawing>
           <wp:inline distT="0" distB="0" distL="0" distR="0" wp14:anchorId="2DC13200" wp14:editId="6E531079">
             <wp:extent cx="5943600" cy="2908935"/>
@@ -687,8 +679,6 @@
         </w:rPr>
         <w:t xml:space="preserve"> </w:t>
       </w:r>
-      <w:bookmarkStart w:id="0" w:name="_GoBack"/>
-      <w:bookmarkEnd w:id="0"/>
       <w:proofErr w:type="spellStart"/>
       <w:r>
         <w:rPr>
@@ -745,7 +735,6 @@
         <w:rPr>
           <w:noProof/>
         </w:rPr>
-        <w:lastRenderedPageBreak/>
         <w:drawing>
           <wp:inline distT="0" distB="0" distL="0" distR="0" wp14:anchorId="425C2E18" wp14:editId="72C083C6">
             <wp:extent cx="5943600" cy="3339465"/>
@@ -817,6 +806,10 @@
     </w:p>
     <w:p>
       <w:r>
+        <w:rPr>
+          <w:noProof/>
+        </w:rPr>
+        <w:lastRenderedPageBreak/>
         <w:drawing>
           <wp:inline distT="0" distB="0" distL="0" distR="0" wp14:anchorId="4B87229F" wp14:editId="31FB9750">
             <wp:extent cx="5943600" cy="1320800"/>

</xml_diff>